<commit_message>
Manual: add blueprint frontispiece to title page
- Add docs/manual/figures/blueprint-frontispiece.jpg (artistic render)
- Place on manual title page, captioned as a stylized illustration (not a
  technical drawing) to keep it distinct from the accurate engineering drawings
- Rebuild DOCX + re-export PDF

Co-Authored-By: Claude Opus 4.8 <noreply@anthropic.com>
</commit_message>
<xml_diff>
--- a/docs/manual/LR-Master-13505-Workshop-Manual.docx
+++ b/docs/manual/LR-Master-13505-Workshop-Manual.docx
@@ -3,9 +3,6 @@
 <w:document xmlns:wpc="http://schemas.microsoft.com/office/word/2010/wordprocessingCanvas" xmlns:mo="http://schemas.microsoft.com/office/mac/office/2008/main" xmlns:mc="http://schemas.openxmlformats.org/markup-compatibility/2006" xmlns:mv="urn:schemas-microsoft-com:mac:vml" xmlns:o="urn:schemas-microsoft-com:office:office" xmlns:r="http://schemas.openxmlformats.org/officeDocument/2006/relationships" xmlns:m="http://schemas.openxmlformats.org/officeDocument/2006/math" xmlns:v="urn:schemas-microsoft-com:vml" xmlns:wp14="http://schemas.microsoft.com/office/word/2010/wordprocessingDrawing" xmlns:wp="http://schemas.openxmlformats.org/drawingml/2006/wordprocessingDrawing" xmlns:w10="urn:schemas-microsoft-com:office:word" xmlns:w="http://schemas.openxmlformats.org/wordprocessingml/2006/main" xmlns:w14="http://schemas.microsoft.com/office/word/2010/wordml" xmlns:wpg="http://schemas.microsoft.com/office/word/2010/wordprocessingGroup" xmlns:wpi="http://schemas.microsoft.com/office/word/2010/wordprocessingInk" xmlns:wne="http://schemas.microsoft.com/office/word/2006/wordml" xmlns:wps="http://schemas.microsoft.com/office/word/2010/wordprocessingShape" mc:Ignorable="w14 wp14">
   <w:body>
     <w:p/>
-    <w:p/>
-    <w:p/>
-    <w:p/>
     <w:p>
       <w:pPr>
         <w:spacing w:after="40"/>
@@ -62,10 +59,59 @@
       </w:r>
     </w:p>
     <w:p/>
-    <w:p/>
-    <w:p/>
-    <w:p/>
-    <w:p/>
+    <w:p>
+      <w:pPr>
+        <w:jc w:val="center"/>
+      </w:pPr>
+      <w:r>
+        <w:drawing>
+          <wp:inline xmlns:a="http://schemas.openxmlformats.org/drawingml/2006/main" xmlns:pic="http://schemas.openxmlformats.org/drawingml/2006/picture">
+            <wp:extent cx="3108960" cy="4146437"/>
+            <wp:docPr id="1" name="Picture 1"/>
+            <wp:cNvGraphicFramePr>
+              <a:graphicFrameLocks noChangeAspect="1"/>
+            </wp:cNvGraphicFramePr>
+            <a:graphic>
+              <a:graphicData uri="http://schemas.openxmlformats.org/drawingml/2006/picture">
+                <pic:pic>
+                  <pic:nvPicPr>
+                    <pic:cNvPr id="0" name="blueprint-frontispiece.jpg"/>
+                    <pic:cNvPicPr/>
+                  </pic:nvPicPr>
+                  <pic:blipFill>
+                    <a:blip r:embed="rId9"/>
+                    <a:stretch>
+                      <a:fillRect/>
+                    </a:stretch>
+                  </pic:blipFill>
+                  <pic:spPr>
+                    <a:xfrm>
+                      <a:off x="0" y="0"/>
+                      <a:ext cx="3108960" cy="4146437"/>
+                    </a:xfrm>
+                    <a:prstGeom prst="rect"/>
+                  </pic:spPr>
+                </pic:pic>
+              </a:graphicData>
+            </a:graphic>
+          </wp:inline>
+        </w:drawing>
+      </w:r>
+    </w:p>
+    <w:p>
+      <w:pPr>
+        <w:spacing w:after="160"/>
+        <w:jc w:val="center"/>
+      </w:pPr>
+      <w:r>
+        <w:rPr>
+          <w:i/>
+          <w:color w:val="555555"/>
+          <w:sz w:val="17"/>
+        </w:rPr>
+        <w:t>Artistic blueprint rendering — stylized illustration, not a technical drawing.</w:t>
+      </w:r>
+    </w:p>
     <w:p/>
     <w:p>
       <w:pPr>
@@ -487,7 +533,7 @@
         <w:drawing>
           <wp:inline xmlns:a="http://schemas.openxmlformats.org/drawingml/2006/main" xmlns:pic="http://schemas.openxmlformats.org/drawingml/2006/picture">
             <wp:extent cx="5943600" cy="4121025"/>
-            <wp:docPr id="1" name="Picture 1"/>
+            <wp:docPr id="2" name="Picture 2"/>
             <wp:cNvGraphicFramePr>
               <a:graphicFrameLocks noChangeAspect="1"/>
             </wp:cNvGraphicFramePr>
@@ -499,7 +545,7 @@
                     <pic:cNvPicPr/>
                   </pic:nvPicPr>
                   <pic:blipFill>
-                    <a:blip r:embed="rId9"/>
+                    <a:blip r:embed="rId10"/>
                     <a:stretch>
                       <a:fillRect/>
                     </a:stretch>
@@ -1699,7 +1745,7 @@
         <w:drawing>
           <wp:inline xmlns:a="http://schemas.openxmlformats.org/drawingml/2006/main" xmlns:pic="http://schemas.openxmlformats.org/drawingml/2006/picture">
             <wp:extent cx="5943600" cy="4057463"/>
-            <wp:docPr id="2" name="Picture 2"/>
+            <wp:docPr id="3" name="Picture 3"/>
             <wp:cNvGraphicFramePr>
               <a:graphicFrameLocks noChangeAspect="1"/>
             </wp:cNvGraphicFramePr>
@@ -1711,7 +1757,7 @@
                     <pic:cNvPicPr/>
                   </pic:nvPicPr>
                   <pic:blipFill>
-                    <a:blip r:embed="rId10"/>
+                    <a:blip r:embed="rId11"/>
                     <a:stretch>
                       <a:fillRect/>
                     </a:stretch>
@@ -2720,7 +2766,7 @@
         <w:drawing>
           <wp:inline xmlns:a="http://schemas.openxmlformats.org/drawingml/2006/main" xmlns:pic="http://schemas.openxmlformats.org/drawingml/2006/picture">
             <wp:extent cx="4984558" cy="7315200"/>
-            <wp:docPr id="3" name="Picture 3"/>
+            <wp:docPr id="4" name="Picture 4"/>
             <wp:cNvGraphicFramePr>
               <a:graphicFrameLocks noChangeAspect="1"/>
             </wp:cNvGraphicFramePr>
@@ -2732,7 +2778,7 @@
                     <pic:cNvPicPr/>
                   </pic:nvPicPr>
                   <pic:blipFill>
-                    <a:blip r:embed="rId11"/>
+                    <a:blip r:embed="rId12"/>
                     <a:stretch>
                       <a:fillRect/>
                     </a:stretch>
@@ -4371,7 +4417,7 @@
         <w:drawing>
           <wp:inline xmlns:a="http://schemas.openxmlformats.org/drawingml/2006/main" xmlns:pic="http://schemas.openxmlformats.org/drawingml/2006/picture">
             <wp:extent cx="5943600" cy="4057463"/>
-            <wp:docPr id="4" name="Picture 4"/>
+            <wp:docPr id="5" name="Picture 5"/>
             <wp:cNvGraphicFramePr>
               <a:graphicFrameLocks noChangeAspect="1"/>
             </wp:cNvGraphicFramePr>
@@ -4383,7 +4429,7 @@
                     <pic:cNvPicPr/>
                   </pic:nvPicPr>
                   <pic:blipFill>
-                    <a:blip r:embed="rId10"/>
+                    <a:blip r:embed="rId11"/>
                     <a:stretch>
                       <a:fillRect/>
                     </a:stretch>

</xml_diff>